<commit_message>
Fix remaining document layout and add structural checks
</commit_message>
<xml_diff>
--- a/docs/Technical_specifications.docx
+++ b/docs/Technical_specifications.docx
@@ -1517,34 +1517,34 @@
         <w:rPr>
           <w:lang w:val="ru-RU"/>
         </w:rPr>
-        <w:t>Студент группы ___</w:t>
+        <w:t>Студент группы РК6-45Б</w:t>
       </w:r>
       <w:r>
         <w:rPr>
           <w:u w:val="single"/>
           <w:lang w:val="ru-RU"/>
         </w:rPr>
-        <w:t>РК6 4</w:t>
+        <w:t/>
       </w:r>
       <w:r>
         <w:rPr>
           <w:u w:val="single"/>
           <w:lang w:val="ru-RU"/>
         </w:rPr>
-        <w:t>5</w:t>
+        <w:t/>
       </w:r>
       <w:r>
         <w:rPr>
           <w:u w:val="single"/>
           <w:lang w:val="ru-RU"/>
         </w:rPr>
-        <w:t>Б</w:t>
-      </w:r>
-      <w:r>
-        <w:rPr>
-          <w:lang w:val="ru-RU"/>
-        </w:rPr>
-        <w:t>_____</w:t>
+        <w:t/>
+      </w:r>
+      <w:r>
+        <w:rPr>
+          <w:lang w:val="ru-RU"/>
+        </w:rPr>
+        <w:t/>
       </w:r>
     </w:p>
     <w:p>
@@ -5096,94 +5096,601 @@
     </w:p>
     <w:p>
       <w:pPr>
-        <w:spacing w:after="120"/>
-        <w:rPr>
-          <w:rFonts w:ascii="Courier New" w:eastAsia="Courier New" w:hAnsi="Courier New"/>
-          <w:i/>
-          <w:iCs/>
-          <w:sz w:val="20"/>
-          <w:lang w:val="en-US"/>
-        </w:rPr>
-      </w:pPr>
-      <w:r>
+        <w:spacing w:before="0" w:after="0" w:line="220" w:lineRule="exact"/>
+        <w:ind w:firstLine="0"/>
+        <w:keepNext w:val="0"/>
+        <w:widowControl w:val="0"/>
+      </w:pPr>
+      <w:r>
+        <w:rPr>
+          <w:rFonts w:ascii="Courier New" w:hAnsi="Courier New"/>
+          <w:sz w:val="18"/>
+        </w:rPr>
         <w:t xml:space="preserve">from pathlib import Path</w:t>
-        <w:br/>
+      </w:r>
+    </w:p>
+    <w:p>
+      <w:pPr>
+        <w:spacing w:before="0" w:after="0" w:line="220" w:lineRule="exact"/>
+        <w:ind w:firstLine="0"/>
+        <w:keepNext w:val="0"/>
+        <w:widowControl w:val="0"/>
+      </w:pPr>
+      <w:r>
+        <w:rPr>
+          <w:rFonts w:ascii="Courier New" w:hAnsi="Courier New"/>
+          <w:sz w:val="18"/>
+        </w:rPr>
         <w:t xml:space="preserve"/>
-        <w:br/>
+      </w:r>
+    </w:p>
+    <w:p>
+      <w:pPr>
+        <w:spacing w:before="0" w:after="0" w:line="220" w:lineRule="exact"/>
+        <w:ind w:firstLine="0"/>
+        <w:keepNext w:val="0"/>
+        <w:widowControl w:val="0"/>
+      </w:pPr>
+      <w:r>
+        <w:rPr>
+          <w:rFonts w:ascii="Courier New" w:hAnsi="Courier New"/>
+          <w:sz w:val="18"/>
+        </w:rPr>
         <w:t xml:space="preserve">DATA_DIR = next((p for p in (Path("notebook"), Path("."))</w:t>
-        <w:br/>
+      </w:r>
+    </w:p>
+    <w:p>
+      <w:pPr>
+        <w:spacing w:before="0" w:after="0" w:line="220" w:lineRule="exact"/>
+        <w:ind w:firstLine="0"/>
+        <w:keepNext w:val="0"/>
+        <w:widowControl w:val="0"/>
+      </w:pPr>
+      <w:r>
+        <w:rPr>
+          <w:rFonts w:ascii="Courier New" w:hAnsi="Courier New"/>
+          <w:sz w:val="18"/>
+        </w:rPr>
         <w:t xml:space="preserve">                 if all((p / name).is_file() for name in ("CISI.ALL", "CISI.QRY", "CISI.REL"))), None)</w:t>
-        <w:br/>
+      </w:r>
+    </w:p>
+    <w:p>
+      <w:pPr>
+        <w:spacing w:before="0" w:after="0" w:line="220" w:lineRule="exact"/>
+        <w:ind w:firstLine="0"/>
+        <w:keepNext w:val="0"/>
+        <w:widowControl w:val="0"/>
+      </w:pPr>
+      <w:r>
+        <w:rPr>
+          <w:rFonts w:ascii="Courier New" w:hAnsi="Courier New"/>
+          <w:sz w:val="18"/>
+        </w:rPr>
         <w:t xml:space="preserve">if DATA_DIR is None:</w:t>
-        <w:br/>
+      </w:r>
+    </w:p>
+    <w:p>
+      <w:pPr>
+        <w:spacing w:before="0" w:after="0" w:line="220" w:lineRule="exact"/>
+        <w:ind w:firstLine="0"/>
+        <w:keepNext w:val="0"/>
+        <w:widowControl w:val="0"/>
+      </w:pPr>
+      <w:r>
+        <w:rPr>
+          <w:rFonts w:ascii="Courier New" w:hAnsi="Courier New"/>
+          <w:sz w:val="18"/>
+        </w:rPr>
         <w:t xml:space="preserve">    raise FileNotFoundError("Run this notebook from the repository root or the notebook directory.")</w:t>
-        <w:br/>
+      </w:r>
+    </w:p>
+    <w:p>
+      <w:pPr>
+        <w:spacing w:before="0" w:after="0" w:line="220" w:lineRule="exact"/>
+        <w:ind w:firstLine="0"/>
+        <w:keepNext w:val="0"/>
+        <w:widowControl w:val="0"/>
+      </w:pPr>
+      <w:r>
+        <w:rPr>
+          <w:rFonts w:ascii="Courier New" w:hAnsi="Courier New"/>
+          <w:sz w:val="18"/>
+        </w:rPr>
         <w:t xml:space="preserve"/>
-        <w:br/>
+      </w:r>
+    </w:p>
+    <w:p>
+      <w:pPr>
+        <w:spacing w:before="0" w:after="0" w:line="220" w:lineRule="exact"/>
+        <w:ind w:firstLine="0"/>
+        <w:keepNext w:val="0"/>
+        <w:widowControl w:val="0"/>
+      </w:pPr>
+      <w:r>
+        <w:rPr>
+          <w:rFonts w:ascii="Courier New" w:hAnsi="Courier New"/>
+          <w:sz w:val="18"/>
+        </w:rPr>
         <w:t xml:space="preserve">def data_path(filename):</w:t>
-        <w:br/>
+      </w:r>
+    </w:p>
+    <w:p>
+      <w:pPr>
+        <w:spacing w:before="0" w:after="0" w:line="220" w:lineRule="exact"/>
+        <w:ind w:firstLine="0"/>
+        <w:keepNext w:val="0"/>
+        <w:widowControl w:val="0"/>
+      </w:pPr>
+      <w:r>
+        <w:rPr>
+          <w:rFonts w:ascii="Courier New" w:hAnsi="Courier New"/>
+          <w:sz w:val="18"/>
+        </w:rPr>
         <w:t xml:space="preserve">    return DATA_DIR / filename</w:t>
-        <w:br/>
+      </w:r>
+    </w:p>
+    <w:p>
+      <w:pPr>
+        <w:spacing w:before="0" w:after="0" w:line="220" w:lineRule="exact"/>
+        <w:ind w:firstLine="0"/>
+        <w:keepNext w:val="0"/>
+        <w:widowControl w:val="0"/>
+      </w:pPr>
+      <w:r>
+        <w:rPr>
+          <w:rFonts w:ascii="Courier New" w:hAnsi="Courier New"/>
+          <w:sz w:val="18"/>
+        </w:rPr>
         <w:t xml:space="preserve"/>
-        <w:br/>
+      </w:r>
+    </w:p>
+    <w:p>
+      <w:pPr>
+        <w:spacing w:before="0" w:after="0" w:line="220" w:lineRule="exact"/>
+        <w:ind w:firstLine="0"/>
+        <w:keepNext w:val="0"/>
+        <w:widowControl w:val="0"/>
+      </w:pPr>
+      <w:r>
+        <w:rPr>
+          <w:rFonts w:ascii="Courier New" w:hAnsi="Courier New"/>
+          <w:sz w:val="18"/>
+        </w:rPr>
         <w:t xml:space="preserve">def parse(filename):</w:t>
-        <w:br/>
+      </w:r>
+    </w:p>
+    <w:p>
+      <w:pPr>
+        <w:spacing w:before="0" w:after="0" w:line="220" w:lineRule="exact"/>
+        <w:ind w:firstLine="0"/>
+        <w:keepNext w:val="0"/>
+        <w:widowControl w:val="0"/>
+      </w:pPr>
+      <w:r>
+        <w:rPr>
+          <w:rFonts w:ascii="Courier New" w:hAnsi="Courier New"/>
+          <w:sz w:val="18"/>
+        </w:rPr>
         <w:t xml:space="preserve">    records = {}</w:t>
-        <w:br/>
+      </w:r>
+    </w:p>
+    <w:p>
+      <w:pPr>
+        <w:spacing w:before="0" w:after="0" w:line="220" w:lineRule="exact"/>
+        <w:ind w:firstLine="0"/>
+        <w:keepNext w:val="0"/>
+        <w:widowControl w:val="0"/>
+      </w:pPr>
+      <w:r>
+        <w:rPr>
+          <w:rFonts w:ascii="Courier New" w:hAnsi="Courier New"/>
+          <w:sz w:val="18"/>
+        </w:rPr>
         <w:t xml:space="preserve">    record = None</w:t>
-        <w:br/>
+      </w:r>
+    </w:p>
+    <w:p>
+      <w:pPr>
+        <w:spacing w:before="0" w:after="0" w:line="220" w:lineRule="exact"/>
+        <w:ind w:firstLine="0"/>
+        <w:keepNext w:val="0"/>
+        <w:widowControl w:val="0"/>
+      </w:pPr>
+      <w:r>
+        <w:rPr>
+          <w:rFonts w:ascii="Courier New" w:hAnsi="Courier New"/>
+          <w:sz w:val="18"/>
+        </w:rPr>
         <w:t xml:space="preserve">    field = None</w:t>
-        <w:br/>
+      </w:r>
+    </w:p>
+    <w:p>
+      <w:pPr>
+        <w:spacing w:before="0" w:after="0" w:line="220" w:lineRule="exact"/>
+        <w:ind w:firstLine="0"/>
+        <w:keepNext w:val="0"/>
+        <w:widowControl w:val="0"/>
+      </w:pPr>
+      <w:r>
+        <w:rPr>
+          <w:rFonts w:ascii="Courier New" w:hAnsi="Courier New"/>
+          <w:sz w:val="18"/>
+        </w:rPr>
         <w:t xml:space="preserve">    fields = {".T": "title", ".A": "author", ".B": "year", ".W": "text", ".X": "x_ref"}</w:t>
-        <w:br/>
+      </w:r>
+    </w:p>
+    <w:p>
+      <w:pPr>
+        <w:spacing w:before="0" w:after="0" w:line="220" w:lineRule="exact"/>
+        <w:ind w:firstLine="0"/>
+        <w:keepNext w:val="0"/>
+        <w:widowControl w:val="0"/>
+      </w:pPr>
+      <w:r>
+        <w:rPr>
+          <w:rFonts w:ascii="Courier New" w:hAnsi="Courier New"/>
+          <w:sz w:val="18"/>
+        </w:rPr>
         <w:t xml:space="preserve">    with open(filename, encoding="utf-8") as stream:</w:t>
-        <w:br/>
+      </w:r>
+    </w:p>
+    <w:p>
+      <w:pPr>
+        <w:spacing w:before="0" w:after="0" w:line="220" w:lineRule="exact"/>
+        <w:ind w:firstLine="0"/>
+        <w:keepNext w:val="0"/>
+        <w:widowControl w:val="0"/>
+      </w:pPr>
+      <w:r>
+        <w:rPr>
+          <w:rFonts w:ascii="Courier New" w:hAnsi="Courier New"/>
+          <w:sz w:val="18"/>
+        </w:rPr>
         <w:t xml:space="preserve">        for number, raw in enumerate(stream, 1):</w:t>
-        <w:br/>
+      </w:r>
+    </w:p>
+    <w:p>
+      <w:pPr>
+        <w:spacing w:before="0" w:after="0" w:line="220" w:lineRule="exact"/>
+        <w:ind w:firstLine="0"/>
+        <w:keepNext w:val="0"/>
+        <w:widowControl w:val="0"/>
+      </w:pPr>
+      <w:r>
+        <w:rPr>
+          <w:rFonts w:ascii="Courier New" w:hAnsi="Courier New"/>
+          <w:sz w:val="18"/>
+        </w:rPr>
         <w:t xml:space="preserve">            line = raw.strip()</w:t>
-        <w:br/>
+      </w:r>
+    </w:p>
+    <w:p>
+      <w:pPr>
+        <w:spacing w:before="0" w:after="0" w:line="220" w:lineRule="exact"/>
+        <w:ind w:firstLine="0"/>
+        <w:keepNext w:val="0"/>
+        <w:widowControl w:val="0"/>
+      </w:pPr>
+      <w:r>
+        <w:rPr>
+          <w:rFonts w:ascii="Courier New" w:hAnsi="Courier New"/>
+          <w:sz w:val="18"/>
+        </w:rPr>
         <w:t xml:space="preserve">            if not line:</w:t>
-        <w:br/>
+      </w:r>
+    </w:p>
+    <w:p>
+      <w:pPr>
+        <w:spacing w:before="0" w:after="0" w:line="220" w:lineRule="exact"/>
+        <w:ind w:firstLine="0"/>
+        <w:keepNext w:val="0"/>
+        <w:widowControl w:val="0"/>
+      </w:pPr>
+      <w:r>
+        <w:rPr>
+          <w:rFonts w:ascii="Courier New" w:hAnsi="Courier New"/>
+          <w:sz w:val="18"/>
+        </w:rPr>
         <w:t xml:space="preserve">                continue</w:t>
-        <w:br/>
+      </w:r>
+    </w:p>
+    <w:p>
+      <w:pPr>
+        <w:spacing w:before="0" w:after="0" w:line="220" w:lineRule="exact"/>
+        <w:ind w:firstLine="0"/>
+        <w:keepNext w:val="0"/>
+        <w:widowControl w:val="0"/>
+      </w:pPr>
+      <w:r>
+        <w:rPr>
+          <w:rFonts w:ascii="Courier New" w:hAnsi="Courier New"/>
+          <w:sz w:val="18"/>
+        </w:rPr>
         <w:t xml:space="preserve">            if line.startswith(".I "):</w:t>
-        <w:br/>
+      </w:r>
+    </w:p>
+    <w:p>
+      <w:pPr>
+        <w:spacing w:before="0" w:after="0" w:line="220" w:lineRule="exact"/>
+        <w:ind w:firstLine="0"/>
+        <w:keepNext w:val="0"/>
+        <w:widowControl w:val="0"/>
+      </w:pPr>
+      <w:r>
+        <w:rPr>
+          <w:rFonts w:ascii="Courier New" w:hAnsi="Courier New"/>
+          <w:sz w:val="18"/>
+        </w:rPr>
         <w:t xml:space="preserve">                doc_id = int(line.split()[1])</w:t>
-        <w:br/>
+      </w:r>
+    </w:p>
+    <w:p>
+      <w:pPr>
+        <w:spacing w:before="0" w:after="0" w:line="220" w:lineRule="exact"/>
+        <w:ind w:firstLine="0"/>
+        <w:keepNext w:val="0"/>
+        <w:widowControl w:val="0"/>
+      </w:pPr>
+      <w:r>
+        <w:rPr>
+          <w:rFonts w:ascii="Courier New" w:hAnsi="Courier New"/>
+          <w:sz w:val="18"/>
+        </w:rPr>
         <w:t xml:space="preserve">                if doc_id in records:</w:t>
-        <w:br/>
+      </w:r>
+    </w:p>
+    <w:p>
+      <w:pPr>
+        <w:spacing w:before="0" w:after="0" w:line="220" w:lineRule="exact"/>
+        <w:ind w:firstLine="0"/>
+        <w:keepNext w:val="0"/>
+        <w:widowControl w:val="0"/>
+      </w:pPr>
+      <w:r>
+        <w:rPr>
+          <w:rFonts w:ascii="Courier New" w:hAnsi="Courier New"/>
+          <w:sz w:val="18"/>
+        </w:rPr>
         <w:t xml:space="preserve">                    raise ValueError(f"Duplicate ID {doc_id} in {filename}:{number}")</w:t>
-        <w:br/>
+      </w:r>
+    </w:p>
+    <w:p>
+      <w:pPr>
+        <w:spacing w:before="0" w:after="0" w:line="220" w:lineRule="exact"/>
+        <w:ind w:firstLine="0"/>
+        <w:keepNext w:val="0"/>
+        <w:widowControl w:val="0"/>
+      </w:pPr>
+      <w:r>
+        <w:rPr>
+          <w:rFonts w:ascii="Courier New" w:hAnsi="Courier New"/>
+          <w:sz w:val="18"/>
+        </w:rPr>
         <w:t xml:space="preserve">                record = {"id": doc_id, "title": "", "author": [], "year": "", "text": "", "x_ref": []}</w:t>
-        <w:br/>
+      </w:r>
+    </w:p>
+    <w:p>
+      <w:pPr>
+        <w:spacing w:before="0" w:after="0" w:line="220" w:lineRule="exact"/>
+        <w:ind w:firstLine="0"/>
+        <w:keepNext w:val="0"/>
+        <w:widowControl w:val="0"/>
+      </w:pPr>
+      <w:r>
+        <w:rPr>
+          <w:rFonts w:ascii="Courier New" w:hAnsi="Courier New"/>
+          <w:sz w:val="18"/>
+        </w:rPr>
         <w:t xml:space="preserve">                records[doc_id] = record</w:t>
-        <w:br/>
+      </w:r>
+    </w:p>
+    <w:p>
+      <w:pPr>
+        <w:spacing w:before="0" w:after="0" w:line="220" w:lineRule="exact"/>
+        <w:ind w:firstLine="0"/>
+        <w:keepNext w:val="0"/>
+        <w:widowControl w:val="0"/>
+      </w:pPr>
+      <w:r>
+        <w:rPr>
+          <w:rFonts w:ascii="Courier New" w:hAnsi="Courier New"/>
+          <w:sz w:val="18"/>
+        </w:rPr>
         <w:t xml:space="preserve">                field = None</w:t>
-        <w:br/>
+      </w:r>
+    </w:p>
+    <w:p>
+      <w:pPr>
+        <w:spacing w:before="0" w:after="0" w:line="220" w:lineRule="exact"/>
+        <w:ind w:firstLine="0"/>
+        <w:keepNext w:val="0"/>
+        <w:widowControl w:val="0"/>
+      </w:pPr>
+      <w:r>
+        <w:rPr>
+          <w:rFonts w:ascii="Courier New" w:hAnsi="Courier New"/>
+          <w:sz w:val="18"/>
+        </w:rPr>
         <w:t xml:space="preserve">            elif line.startswith(".") and len(line.split()[0]) == 2:</w:t>
-        <w:br/>
+      </w:r>
+    </w:p>
+    <w:p>
+      <w:pPr>
+        <w:spacing w:before="0" w:after="0" w:line="220" w:lineRule="exact"/>
+        <w:ind w:firstLine="0"/>
+        <w:keepNext w:val="0"/>
+        <w:widowControl w:val="0"/>
+      </w:pPr>
+      <w:r>
+        <w:rPr>
+          <w:rFonts w:ascii="Courier New" w:hAnsi="Courier New"/>
+          <w:sz w:val="18"/>
+        </w:rPr>
         <w:t xml:space="preserve">                field = fields.get(line.split()[0])</w:t>
-        <w:br/>
+      </w:r>
+    </w:p>
+    <w:p>
+      <w:pPr>
+        <w:spacing w:before="0" w:after="0" w:line="220" w:lineRule="exact"/>
+        <w:ind w:firstLine="0"/>
+        <w:keepNext w:val="0"/>
+        <w:widowControl w:val="0"/>
+      </w:pPr>
+      <w:r>
+        <w:rPr>
+          <w:rFonts w:ascii="Courier New" w:hAnsi="Courier New"/>
+          <w:sz w:val="18"/>
+        </w:rPr>
         <w:t xml:space="preserve">            elif record is not None and field is not None:</w:t>
-        <w:br/>
+      </w:r>
+    </w:p>
+    <w:p>
+      <w:pPr>
+        <w:spacing w:before="0" w:after="0" w:line="220" w:lineRule="exact"/>
+        <w:ind w:firstLine="0"/>
+        <w:keepNext w:val="0"/>
+        <w:widowControl w:val="0"/>
+      </w:pPr>
+      <w:r>
+        <w:rPr>
+          <w:rFonts w:ascii="Courier New" w:hAnsi="Courier New"/>
+          <w:sz w:val="18"/>
+        </w:rPr>
         <w:t xml:space="preserve">                if field == "x_ref":</w:t>
-        <w:br/>
+      </w:r>
+    </w:p>
+    <w:p>
+      <w:pPr>
+        <w:spacing w:before="0" w:after="0" w:line="220" w:lineRule="exact"/>
+        <w:ind w:firstLine="0"/>
+        <w:keepNext w:val="0"/>
+        <w:widowControl w:val="0"/>
+      </w:pPr>
+      <w:r>
+        <w:rPr>
+          <w:rFonts w:ascii="Courier New" w:hAnsi="Courier New"/>
+          <w:sz w:val="18"/>
+        </w:rPr>
         <w:t xml:space="preserve">                    values = tuple(map(int, line.split()))</w:t>
-        <w:br/>
+      </w:r>
+    </w:p>
+    <w:p>
+      <w:pPr>
+        <w:spacing w:before="0" w:after="0" w:line="220" w:lineRule="exact"/>
+        <w:ind w:firstLine="0"/>
+        <w:keepNext w:val="0"/>
+        <w:widowControl w:val="0"/>
+      </w:pPr>
+      <w:r>
+        <w:rPr>
+          <w:rFonts w:ascii="Courier New" w:hAnsi="Courier New"/>
+          <w:sz w:val="18"/>
+        </w:rPr>
         <w:t xml:space="preserve">                    if len(values) != 3:</w:t>
-        <w:br/>
+      </w:r>
+    </w:p>
+    <w:p>
+      <w:pPr>
+        <w:spacing w:before="0" w:after="0" w:line="220" w:lineRule="exact"/>
+        <w:ind w:firstLine="0"/>
+        <w:keepNext w:val="0"/>
+        <w:widowControl w:val="0"/>
+      </w:pPr>
+      <w:r>
+        <w:rPr>
+          <w:rFonts w:ascii="Courier New" w:hAnsi="Courier New"/>
+          <w:sz w:val="18"/>
+        </w:rPr>
         <w:t xml:space="preserve">                        raise ValueError(f"Invalid cross-reference in {filename}:{number}")</w:t>
-        <w:br/>
+      </w:r>
+    </w:p>
+    <w:p>
+      <w:pPr>
+        <w:spacing w:before="0" w:after="0" w:line="220" w:lineRule="exact"/>
+        <w:ind w:firstLine="0"/>
+        <w:keepNext w:val="0"/>
+        <w:widowControl w:val="0"/>
+      </w:pPr>
+      <w:r>
+        <w:rPr>
+          <w:rFonts w:ascii="Courier New" w:hAnsi="Courier New"/>
+          <w:sz w:val="18"/>
+        </w:rPr>
         <w:t xml:space="preserve">                    record[field].append(values)</w:t>
-        <w:br/>
+      </w:r>
+    </w:p>
+    <w:p>
+      <w:pPr>
+        <w:spacing w:before="0" w:after="0" w:line="220" w:lineRule="exact"/>
+        <w:ind w:firstLine="0"/>
+        <w:keepNext w:val="0"/>
+        <w:widowControl w:val="0"/>
+      </w:pPr>
+      <w:r>
+        <w:rPr>
+          <w:rFonts w:ascii="Courier New" w:hAnsi="Courier New"/>
+          <w:sz w:val="18"/>
+        </w:rPr>
         <w:t xml:space="preserve">                elif field == "author":</w:t>
-        <w:br/>
+      </w:r>
+    </w:p>
+    <w:p>
+      <w:pPr>
+        <w:spacing w:before="0" w:after="0" w:line="220" w:lineRule="exact"/>
+        <w:ind w:firstLine="0"/>
+        <w:keepNext w:val="0"/>
+        <w:widowControl w:val="0"/>
+      </w:pPr>
+      <w:r>
+        <w:rPr>
+          <w:rFonts w:ascii="Courier New" w:hAnsi="Courier New"/>
+          <w:sz w:val="18"/>
+        </w:rPr>
         <w:t xml:space="preserve">                    record[field].append(line)</w:t>
-        <w:br/>
+      </w:r>
+    </w:p>
+    <w:p>
+      <w:pPr>
+        <w:spacing w:before="0" w:after="0" w:line="220" w:lineRule="exact"/>
+        <w:ind w:firstLine="0"/>
+        <w:keepNext w:val="0"/>
+        <w:widowControl w:val="0"/>
+      </w:pPr>
+      <w:r>
+        <w:rPr>
+          <w:rFonts w:ascii="Courier New" w:hAnsi="Courier New"/>
+          <w:sz w:val="18"/>
+        </w:rPr>
         <w:t xml:space="preserve">                else:</w:t>
-        <w:br/>
+      </w:r>
+    </w:p>
+    <w:p>
+      <w:pPr>
+        <w:spacing w:before="0" w:after="0" w:line="220" w:lineRule="exact"/>
+        <w:ind w:firstLine="0"/>
+        <w:keepNext w:val="0"/>
+        <w:widowControl w:val="0"/>
+      </w:pPr>
+      <w:r>
+        <w:rPr>
+          <w:rFonts w:ascii="Courier New" w:hAnsi="Courier New"/>
+          <w:sz w:val="18"/>
+        </w:rPr>
         <w:t xml:space="preserve">                    record[field] = (record[field] + " " + line).strip()</w:t>
-        <w:br/>
+      </w:r>
+    </w:p>
+    <w:p>
+      <w:pPr>
+        <w:spacing w:before="0" w:after="0" w:line="220" w:lineRule="exact"/>
+        <w:ind w:firstLine="0"/>
+        <w:keepNext w:val="0"/>
+        <w:widowControl w:val="0"/>
+      </w:pPr>
+      <w:r>
+        <w:rPr>
+          <w:rFonts w:ascii="Courier New" w:hAnsi="Courier New"/>
+          <w:sz w:val="18"/>
+        </w:rPr>
         <w:t xml:space="preserve">    return records</w:t>
       </w:r>
     </w:p>
@@ -5253,204 +5760,1426 @@
     </w:p>
     <w:p>
       <w:pPr>
-        <w:spacing w:after="120"/>
-        <w:rPr>
-          <w:rFonts w:ascii="Courier New" w:eastAsia="Courier New" w:hAnsi="Courier New"/>
-          <w:i/>
-          <w:iCs/>
-          <w:sz w:val="20"/>
-          <w:lang w:val="en-US"/>
-        </w:rPr>
-      </w:pPr>
-      <w:r>
+        <w:spacing w:before="0" w:after="0" w:line="220" w:lineRule="exact"/>
+        <w:ind w:firstLine="0"/>
+        <w:keepNext w:val="0"/>
+        <w:widowControl w:val="0"/>
+      </w:pPr>
+      <w:r>
+        <w:rPr>
+          <w:rFonts w:ascii="Courier New" w:hAnsi="Courier New"/>
+          <w:sz w:val="18"/>
+        </w:rPr>
         <w:t xml:space="preserve">import nltk</w:t>
-        <w:br/>
+      </w:r>
+    </w:p>
+    <w:p>
+      <w:pPr>
+        <w:spacing w:before="0" w:after="0" w:line="220" w:lineRule="exact"/>
+        <w:ind w:firstLine="0"/>
+        <w:keepNext w:val="0"/>
+        <w:widowControl w:val="0"/>
+      </w:pPr>
+      <w:r>
+        <w:rPr>
+          <w:rFonts w:ascii="Courier New" w:hAnsi="Courier New"/>
+          <w:sz w:val="18"/>
+        </w:rPr>
         <w:t xml:space="preserve">from nltk.corpus import stopwords, wordnet</w:t>
-        <w:br/>
+      </w:r>
+    </w:p>
+    <w:p>
+      <w:pPr>
+        <w:spacing w:before="0" w:after="0" w:line="220" w:lineRule="exact"/>
+        <w:ind w:firstLine="0"/>
+        <w:keepNext w:val="0"/>
+        <w:widowControl w:val="0"/>
+      </w:pPr>
+      <w:r>
+        <w:rPr>
+          <w:rFonts w:ascii="Courier New" w:hAnsi="Courier New"/>
+          <w:sz w:val="18"/>
+        </w:rPr>
         <w:t xml:space="preserve">from nltk.tokenize import word_tokenize</w:t>
-        <w:br/>
+      </w:r>
+    </w:p>
+    <w:p>
+      <w:pPr>
+        <w:spacing w:before="0" w:after="0" w:line="220" w:lineRule="exact"/>
+        <w:ind w:firstLine="0"/>
+        <w:keepNext w:val="0"/>
+        <w:widowControl w:val="0"/>
+      </w:pPr>
+      <w:r>
+        <w:rPr>
+          <w:rFonts w:ascii="Courier New" w:hAnsi="Courier New"/>
+          <w:sz w:val="18"/>
+        </w:rPr>
         <w:t xml:space="preserve">from nltk.stem import PorterStemmer, WordNetLemmatizer</w:t>
-        <w:br/>
+      </w:r>
+    </w:p>
+    <w:p>
+      <w:pPr>
+        <w:spacing w:before="0" w:after="0" w:line="220" w:lineRule="exact"/>
+        <w:ind w:firstLine="0"/>
+        <w:keepNext w:val="0"/>
+        <w:widowControl w:val="0"/>
+      </w:pPr>
+      <w:r>
+        <w:rPr>
+          <w:rFonts w:ascii="Courier New" w:hAnsi="Courier New"/>
+          <w:sz w:val="18"/>
+        </w:rPr>
         <w:t xml:space="preserve"/>
-        <w:br/>
+      </w:r>
+    </w:p>
+    <w:p>
+      <w:pPr>
+        <w:spacing w:before="0" w:after="0" w:line="220" w:lineRule="exact"/>
+        <w:ind w:firstLine="0"/>
+        <w:keepNext w:val="0"/>
+        <w:widowControl w:val="0"/>
+      </w:pPr>
+      <w:r>
+        <w:rPr>
+          <w:rFonts w:ascii="Courier New" w:hAnsi="Courier New"/>
+          <w:sz w:val="18"/>
+        </w:rPr>
         <w:t xml:space="preserve">def ensure_nltk_resource(resource_path, package_name):</w:t>
-        <w:br/>
+      </w:r>
+    </w:p>
+    <w:p>
+      <w:pPr>
+        <w:spacing w:before="0" w:after="0" w:line="220" w:lineRule="exact"/>
+        <w:ind w:firstLine="0"/>
+        <w:keepNext w:val="0"/>
+        <w:widowControl w:val="0"/>
+      </w:pPr>
+      <w:r>
+        <w:rPr>
+          <w:rFonts w:ascii="Courier New" w:hAnsi="Courier New"/>
+          <w:sz w:val="18"/>
+        </w:rPr>
         <w:t xml:space="preserve">    for candidate in (resource_path, resource_path + ".zip"):</w:t>
-        <w:br/>
+      </w:r>
+    </w:p>
+    <w:p>
+      <w:pPr>
+        <w:spacing w:before="0" w:after="0" w:line="220" w:lineRule="exact"/>
+        <w:ind w:firstLine="0"/>
+        <w:keepNext w:val="0"/>
+        <w:widowControl w:val="0"/>
+      </w:pPr>
+      <w:r>
+        <w:rPr>
+          <w:rFonts w:ascii="Courier New" w:hAnsi="Courier New"/>
+          <w:sz w:val="18"/>
+        </w:rPr>
         <w:t xml:space="preserve">        try:</w:t>
-        <w:br/>
+      </w:r>
+    </w:p>
+    <w:p>
+      <w:pPr>
+        <w:spacing w:before="0" w:after="0" w:line="220" w:lineRule="exact"/>
+        <w:ind w:firstLine="0"/>
+        <w:keepNext w:val="0"/>
+        <w:widowControl w:val="0"/>
+      </w:pPr>
+      <w:r>
+        <w:rPr>
+          <w:rFonts w:ascii="Courier New" w:hAnsi="Courier New"/>
+          <w:sz w:val="18"/>
+        </w:rPr>
         <w:t xml:space="preserve">            nltk.data.find(candidate)</w:t>
-        <w:br/>
+      </w:r>
+    </w:p>
+    <w:p>
+      <w:pPr>
+        <w:spacing w:before="0" w:after="0" w:line="220" w:lineRule="exact"/>
+        <w:ind w:firstLine="0"/>
+        <w:keepNext w:val="0"/>
+        <w:widowControl w:val="0"/>
+      </w:pPr>
+      <w:r>
+        <w:rPr>
+          <w:rFonts w:ascii="Courier New" w:hAnsi="Courier New"/>
+          <w:sz w:val="18"/>
+        </w:rPr>
         <w:t xml:space="preserve">            return</w:t>
-        <w:br/>
+      </w:r>
+    </w:p>
+    <w:p>
+      <w:pPr>
+        <w:spacing w:before="0" w:after="0" w:line="220" w:lineRule="exact"/>
+        <w:ind w:firstLine="0"/>
+        <w:keepNext w:val="0"/>
+        <w:widowControl w:val="0"/>
+      </w:pPr>
+      <w:r>
+        <w:rPr>
+          <w:rFonts w:ascii="Courier New" w:hAnsi="Courier New"/>
+          <w:sz w:val="18"/>
+        </w:rPr>
         <w:t xml:space="preserve">        except LookupError:</w:t>
-        <w:br/>
+      </w:r>
+    </w:p>
+    <w:p>
+      <w:pPr>
+        <w:spacing w:before="0" w:after="0" w:line="220" w:lineRule="exact"/>
+        <w:ind w:firstLine="0"/>
+        <w:keepNext w:val="0"/>
+        <w:widowControl w:val="0"/>
+      </w:pPr>
+      <w:r>
+        <w:rPr>
+          <w:rFonts w:ascii="Courier New" w:hAnsi="Courier New"/>
+          <w:sz w:val="18"/>
+        </w:rPr>
         <w:t xml:space="preserve">            pass</w:t>
-        <w:br/>
+      </w:r>
+    </w:p>
+    <w:p>
+      <w:pPr>
+        <w:spacing w:before="0" w:after="0" w:line="220" w:lineRule="exact"/>
+        <w:ind w:firstLine="0"/>
+        <w:keepNext w:val="0"/>
+        <w:widowControl w:val="0"/>
+      </w:pPr>
+      <w:r>
+        <w:rPr>
+          <w:rFonts w:ascii="Courier New" w:hAnsi="Courier New"/>
+          <w:sz w:val="18"/>
+        </w:rPr>
         <w:t xml:space="preserve">    if not nltk.download(package_name, quiet=True):</w:t>
-        <w:br/>
+      </w:r>
+    </w:p>
+    <w:p>
+      <w:pPr>
+        <w:spacing w:before="0" w:after="0" w:line="220" w:lineRule="exact"/>
+        <w:ind w:firstLine="0"/>
+        <w:keepNext w:val="0"/>
+        <w:widowControl w:val="0"/>
+      </w:pPr>
+      <w:r>
+        <w:rPr>
+          <w:rFonts w:ascii="Courier New" w:hAnsi="Courier New"/>
+          <w:sz w:val="18"/>
+        </w:rPr>
         <w:t xml:space="preserve">        raise RuntimeError(f"Missing NLTK resource: {package_name}. Download it and rerun the notebook.")</w:t>
-        <w:br/>
+      </w:r>
+    </w:p>
+    <w:p>
+      <w:pPr>
+        <w:spacing w:before="0" w:after="0" w:line="220" w:lineRule="exact"/>
+        <w:ind w:firstLine="0"/>
+        <w:keepNext w:val="0"/>
+        <w:widowControl w:val="0"/>
+      </w:pPr>
+      <w:r>
+        <w:rPr>
+          <w:rFonts w:ascii="Courier New" w:hAnsi="Courier New"/>
+          <w:sz w:val="18"/>
+        </w:rPr>
         <w:t xml:space="preserve"/>
-        <w:br/>
+      </w:r>
+    </w:p>
+    <w:p>
+      <w:pPr>
+        <w:spacing w:before="0" w:after="0" w:line="220" w:lineRule="exact"/>
+        <w:ind w:firstLine="0"/>
+        <w:keepNext w:val="0"/>
+        <w:widowControl w:val="0"/>
+      </w:pPr>
+      <w:r>
+        <w:rPr>
+          <w:rFonts w:ascii="Courier New" w:hAnsi="Courier New"/>
+          <w:sz w:val="18"/>
+        </w:rPr>
         <w:t xml:space="preserve">ensure_nltk_resource("tokenizers/punkt_tab", "punkt_tab")</w:t>
-        <w:br/>
+      </w:r>
+    </w:p>
+    <w:p>
+      <w:pPr>
+        <w:spacing w:before="0" w:after="0" w:line="220" w:lineRule="exact"/>
+        <w:ind w:firstLine="0"/>
+        <w:keepNext w:val="0"/>
+        <w:widowControl w:val="0"/>
+      </w:pPr>
+      <w:r>
+        <w:rPr>
+          <w:rFonts w:ascii="Courier New" w:hAnsi="Courier New"/>
+          <w:sz w:val="18"/>
+        </w:rPr>
         <w:t xml:space="preserve">ensure_nltk_resource("corpora/stopwords", "stopwords")</w:t>
-        <w:br/>
+      </w:r>
+    </w:p>
+    <w:p>
+      <w:pPr>
+        <w:spacing w:before="0" w:after="0" w:line="220" w:lineRule="exact"/>
+        <w:ind w:firstLine="0"/>
+        <w:keepNext w:val="0"/>
+        <w:widowControl w:val="0"/>
+      </w:pPr>
+      <w:r>
+        <w:rPr>
+          <w:rFonts w:ascii="Courier New" w:hAnsi="Courier New"/>
+          <w:sz w:val="18"/>
+        </w:rPr>
         <w:t xml:space="preserve">ensure_nltk_resource("corpora/wordnet", "wordnet")</w:t>
-        <w:br/>
+      </w:r>
+    </w:p>
+    <w:p>
+      <w:pPr>
+        <w:spacing w:before="0" w:after="0" w:line="220" w:lineRule="exact"/>
+        <w:ind w:firstLine="0"/>
+        <w:keepNext w:val="0"/>
+        <w:widowControl w:val="0"/>
+      </w:pPr>
+      <w:r>
+        <w:rPr>
+          <w:rFonts w:ascii="Courier New" w:hAnsi="Courier New"/>
+          <w:sz w:val="18"/>
+        </w:rPr>
         <w:t xml:space="preserve">wordnet.ensure_loaded()</w:t>
-        <w:br/>
+      </w:r>
+    </w:p>
+    <w:p>
+      <w:pPr>
+        <w:spacing w:before="0" w:after="0" w:line="220" w:lineRule="exact"/>
+        <w:ind w:firstLine="0"/>
+        <w:keepNext w:val="0"/>
+        <w:widowControl w:val="0"/>
+      </w:pPr>
+      <w:r>
+        <w:rPr>
+          <w:rFonts w:ascii="Courier New" w:hAnsi="Courier New"/>
+          <w:sz w:val="18"/>
+        </w:rPr>
         <w:t xml:space="preserve">stop_words = set(stopwords.words("english"))</w:t>
-        <w:br/>
+      </w:r>
+    </w:p>
+    <w:p>
+      <w:pPr>
+        <w:spacing w:before="0" w:after="0" w:line="220" w:lineRule="exact"/>
+        <w:ind w:firstLine="0"/>
+        <w:keepNext w:val="0"/>
+        <w:widowControl w:val="0"/>
+      </w:pPr>
+      <w:r>
+        <w:rPr>
+          <w:rFonts w:ascii="Courier New" w:hAnsi="Courier New"/>
+          <w:sz w:val="18"/>
+        </w:rPr>
         <w:t xml:space="preserve">stemmer = PorterStemmer()</w:t>
-        <w:br/>
+      </w:r>
+    </w:p>
+    <w:p>
+      <w:pPr>
+        <w:spacing w:before="0" w:after="0" w:line="220" w:lineRule="exact"/>
+        <w:ind w:firstLine="0"/>
+        <w:keepNext w:val="0"/>
+        <w:widowControl w:val="0"/>
+      </w:pPr>
+      <w:r>
+        <w:rPr>
+          <w:rFonts w:ascii="Courier New" w:hAnsi="Courier New"/>
+          <w:sz w:val="18"/>
+        </w:rPr>
         <w:t xml:space="preserve">lemmatizer = WordNetLemmatizer()</w:t>
-        <w:br/>
+      </w:r>
+    </w:p>
+    <w:p>
+      <w:pPr>
+        <w:spacing w:before="0" w:after="0" w:line="220" w:lineRule="exact"/>
+        <w:ind w:firstLine="0"/>
+        <w:keepNext w:val="0"/>
+        <w:widowControl w:val="0"/>
+      </w:pPr>
+      <w:r>
+        <w:rPr>
+          <w:rFonts w:ascii="Courier New" w:hAnsi="Courier New"/>
+          <w:sz w:val="18"/>
+        </w:rPr>
         <w:t xml:space="preserve"/>
-        <w:br/>
+      </w:r>
+    </w:p>
+    <w:p>
+      <w:pPr>
+        <w:spacing w:before="0" w:after="0" w:line="220" w:lineRule="exact"/>
+        <w:ind w:firstLine="0"/>
+        <w:keepNext w:val="0"/>
+        <w:widowControl w:val="0"/>
+      </w:pPr>
+      <w:r>
+        <w:rPr>
+          <w:rFonts w:ascii="Courier New" w:hAnsi="Courier New"/>
+          <w:sz w:val="18"/>
+        </w:rPr>
         <w:t xml:space="preserve">def clean_text(text):</w:t>
-        <w:br/>
+      </w:r>
+    </w:p>
+    <w:p>
+      <w:pPr>
+        <w:spacing w:before="0" w:after="0" w:line="220" w:lineRule="exact"/>
+        <w:ind w:firstLine="0"/>
+        <w:keepNext w:val="0"/>
+        <w:widowControl w:val="0"/>
+      </w:pPr>
+      <w:r>
+        <w:rPr>
+          <w:rFonts w:ascii="Courier New" w:hAnsi="Courier New"/>
+          <w:sz w:val="18"/>
+        </w:rPr>
         <w:t xml:space="preserve">    word_tokens = word_tokenize(text.lower())</w:t>
-        <w:br/>
+      </w:r>
+    </w:p>
+    <w:p>
+      <w:pPr>
+        <w:spacing w:before="0" w:after="0" w:line="220" w:lineRule="exact"/>
+        <w:ind w:firstLine="0"/>
+        <w:keepNext w:val="0"/>
+        <w:widowControl w:val="0"/>
+      </w:pPr>
+      <w:r>
+        <w:rPr>
+          <w:rFonts w:ascii="Courier New" w:hAnsi="Courier New"/>
+          <w:sz w:val="18"/>
+        </w:rPr>
         <w:t xml:space="preserve">    filtered = [word for word in word_tokens </w:t>
-        <w:br/>
+      </w:r>
+    </w:p>
+    <w:p>
+      <w:pPr>
+        <w:spacing w:before="0" w:after="0" w:line="220" w:lineRule="exact"/>
+        <w:ind w:firstLine="0"/>
+        <w:keepNext w:val="0"/>
+        <w:widowControl w:val="0"/>
+      </w:pPr>
+      <w:r>
+        <w:rPr>
+          <w:rFonts w:ascii="Courier New" w:hAnsi="Courier New"/>
+          <w:sz w:val="18"/>
+        </w:rPr>
         <w:t xml:space="preserve">                if word not in stop_words and (word.isalpha() or word.isdigit())]</w:t>
-        <w:br/>
+      </w:r>
+    </w:p>
+    <w:p>
+      <w:pPr>
+        <w:spacing w:before="0" w:after="0" w:line="220" w:lineRule="exact"/>
+        <w:ind w:firstLine="0"/>
+        <w:keepNext w:val="0"/>
+        <w:widowControl w:val="0"/>
+      </w:pPr>
+      <w:r>
+        <w:rPr>
+          <w:rFonts w:ascii="Courier New" w:hAnsi="Courier New"/>
+          <w:sz w:val="18"/>
+        </w:rPr>
         <w:t xml:space="preserve">    return filtered</w:t>
-        <w:br/>
+      </w:r>
+    </w:p>
+    <w:p>
+      <w:pPr>
+        <w:spacing w:before="0" w:after="0" w:line="220" w:lineRule="exact"/>
+        <w:ind w:firstLine="0"/>
+        <w:keepNext w:val="0"/>
+        <w:widowControl w:val="0"/>
+      </w:pPr>
+      <w:r>
+        <w:rPr>
+          <w:rFonts w:ascii="Courier New" w:hAnsi="Courier New"/>
+          <w:sz w:val="18"/>
+        </w:rPr>
         <w:t xml:space="preserve"/>
-        <w:br/>
+      </w:r>
+    </w:p>
+    <w:p>
+      <w:pPr>
+        <w:spacing w:before="0" w:after="0" w:line="220" w:lineRule="exact"/>
+        <w:ind w:firstLine="0"/>
+        <w:keepNext w:val="0"/>
+        <w:widowControl w:val="0"/>
+      </w:pPr>
+      <w:r>
+        <w:rPr>
+          <w:rFonts w:ascii="Courier New" w:hAnsi="Courier New"/>
+          <w:sz w:val="18"/>
+        </w:rPr>
         <w:t xml:space="preserve">for doc_id, doc in documents.items():</w:t>
-        <w:br/>
+      </w:r>
+    </w:p>
+    <w:p>
+      <w:pPr>
+        <w:spacing w:before="0" w:after="0" w:line="220" w:lineRule="exact"/>
+        <w:ind w:firstLine="0"/>
+        <w:keepNext w:val="0"/>
+        <w:widowControl w:val="0"/>
+      </w:pPr>
+      <w:r>
+        <w:rPr>
+          <w:rFonts w:ascii="Courier New" w:hAnsi="Courier New"/>
+          <w:sz w:val="18"/>
+        </w:rPr>
         <w:t xml:space="preserve">    doc["raw_words"] = [w for w in word_tokenize((doc["title"] + " " + doc["text"] + " " + " ".join(doc["author"])).lower()) if w.isalpha() or w.isdigit()]</w:t>
-        <w:br/>
+      </w:r>
+    </w:p>
+    <w:p>
+      <w:pPr>
+        <w:spacing w:before="0" w:after="0" w:line="220" w:lineRule="exact"/>
+        <w:ind w:firstLine="0"/>
+        <w:keepNext w:val="0"/>
+        <w:widowControl w:val="0"/>
+      </w:pPr>
+      <w:r>
+        <w:rPr>
+          <w:rFonts w:ascii="Courier New" w:hAnsi="Courier New"/>
+          <w:sz w:val="18"/>
+        </w:rPr>
         <w:t xml:space="preserve">    full_text = doc["title"] + " " + doc["text"]</w:t>
-        <w:br/>
+      </w:r>
+    </w:p>
+    <w:p>
+      <w:pPr>
+        <w:spacing w:before="0" w:after="0" w:line="220" w:lineRule="exact"/>
+        <w:ind w:firstLine="0"/>
+        <w:keepNext w:val="0"/>
+        <w:widowControl w:val="0"/>
+      </w:pPr>
+      <w:r>
+        <w:rPr>
+          <w:rFonts w:ascii="Courier New" w:hAnsi="Courier New"/>
+          <w:sz w:val="18"/>
+        </w:rPr>
         <w:t xml:space="preserve"/>
-        <w:br/>
+      </w:r>
+    </w:p>
+    <w:p>
+      <w:pPr>
+        <w:spacing w:before="0" w:after="0" w:line="220" w:lineRule="exact"/>
+        <w:ind w:firstLine="0"/>
+        <w:keepNext w:val="0"/>
+        <w:widowControl w:val="0"/>
+      </w:pPr>
+      <w:r>
+        <w:rPr>
+          <w:rFonts w:ascii="Courier New" w:hAnsi="Courier New"/>
+          <w:sz w:val="18"/>
+        </w:rPr>
         <w:t xml:space="preserve">    if doc["author"]:</w:t>
-        <w:br/>
+      </w:r>
+    </w:p>
+    <w:p>
+      <w:pPr>
+        <w:spacing w:before="0" w:after="0" w:line="220" w:lineRule="exact"/>
+        <w:ind w:firstLine="0"/>
+        <w:keepNext w:val="0"/>
+        <w:widowControl w:val="0"/>
+      </w:pPr>
+      <w:r>
+        <w:rPr>
+          <w:rFonts w:ascii="Courier New" w:hAnsi="Courier New"/>
+          <w:sz w:val="18"/>
+        </w:rPr>
         <w:t xml:space="preserve">        authors_text = " ".join(doc["author"])</w:t>
-        <w:br/>
+      </w:r>
+    </w:p>
+    <w:p>
+      <w:pPr>
+        <w:spacing w:before="0" w:after="0" w:line="220" w:lineRule="exact"/>
+        <w:ind w:firstLine="0"/>
+        <w:keepNext w:val="0"/>
+        <w:widowControl w:val="0"/>
+      </w:pPr>
+      <w:r>
+        <w:rPr>
+          <w:rFonts w:ascii="Courier New" w:hAnsi="Courier New"/>
+          <w:sz w:val="18"/>
+        </w:rPr>
         <w:t xml:space="preserve">        full_text = full_text + " " + authors_text</w:t>
-        <w:br/>
+      </w:r>
+    </w:p>
+    <w:p>
+      <w:pPr>
+        <w:spacing w:before="0" w:after="0" w:line="220" w:lineRule="exact"/>
+        <w:ind w:firstLine="0"/>
+        <w:keepNext w:val="0"/>
+        <w:widowControl w:val="0"/>
+      </w:pPr>
+      <w:r>
+        <w:rPr>
+          <w:rFonts w:ascii="Courier New" w:hAnsi="Courier New"/>
+          <w:sz w:val="18"/>
+        </w:rPr>
         <w:t xml:space="preserve"/>
-        <w:br/>
+      </w:r>
+    </w:p>
+    <w:p>
+      <w:pPr>
+        <w:spacing w:before="0" w:after="0" w:line="220" w:lineRule="exact"/>
+        <w:ind w:firstLine="0"/>
+        <w:keepNext w:val="0"/>
+        <w:widowControl w:val="0"/>
+      </w:pPr>
+      <w:r>
+        <w:rPr>
+          <w:rFonts w:ascii="Courier New" w:hAnsi="Courier New"/>
+          <w:sz w:val="18"/>
+        </w:rPr>
         <w:t xml:space="preserve">    # Заголовок</w:t>
-        <w:br/>
+      </w:r>
+    </w:p>
+    <w:p>
+      <w:pPr>
+        <w:spacing w:before="0" w:after="0" w:line="220" w:lineRule="exact"/>
+        <w:ind w:firstLine="0"/>
+        <w:keepNext w:val="0"/>
+        <w:widowControl w:val="0"/>
+      </w:pPr>
+      <w:r>
+        <w:rPr>
+          <w:rFonts w:ascii="Courier New" w:hAnsi="Courier New"/>
+          <w:sz w:val="18"/>
+        </w:rPr>
         <w:t xml:space="preserve">    title_tokens = clean_text(doc["title"])</w:t>
-        <w:br/>
+      </w:r>
+    </w:p>
+    <w:p>
+      <w:pPr>
+        <w:spacing w:before="0" w:after="0" w:line="220" w:lineRule="exact"/>
+        <w:ind w:firstLine="0"/>
+        <w:keepNext w:val="0"/>
+        <w:widowControl w:val="0"/>
+      </w:pPr>
+      <w:r>
+        <w:rPr>
+          <w:rFonts w:ascii="Courier New" w:hAnsi="Courier New"/>
+          <w:sz w:val="18"/>
+        </w:rPr>
         <w:t xml:space="preserve">    doc["title_tokens"] = title_tokens</w:t>
-        <w:br/>
+      </w:r>
+    </w:p>
+    <w:p>
+      <w:pPr>
+        <w:spacing w:before="0" w:after="0" w:line="220" w:lineRule="exact"/>
+        <w:ind w:firstLine="0"/>
+        <w:keepNext w:val="0"/>
+        <w:widowControl w:val="0"/>
+      </w:pPr>
+      <w:r>
+        <w:rPr>
+          <w:rFonts w:ascii="Courier New" w:hAnsi="Courier New"/>
+          <w:sz w:val="18"/>
+        </w:rPr>
         <w:t xml:space="preserve">    doc["title_stemmed"] = [stemmer.stem(w) for w in title_tokens]</w:t>
-        <w:br/>
+      </w:r>
+    </w:p>
+    <w:p>
+      <w:pPr>
+        <w:spacing w:before="0" w:after="0" w:line="220" w:lineRule="exact"/>
+        <w:ind w:firstLine="0"/>
+        <w:keepNext w:val="0"/>
+        <w:widowControl w:val="0"/>
+      </w:pPr>
+      <w:r>
+        <w:rPr>
+          <w:rFonts w:ascii="Courier New" w:hAnsi="Courier New"/>
+          <w:sz w:val="18"/>
+        </w:rPr>
         <w:t xml:space="preserve">    doc["title_lemmatized"] = [lemmatizer.lemmatize(w) for w in title_tokens]   </w:t>
-        <w:br/>
+      </w:r>
+    </w:p>
+    <w:p>
+      <w:pPr>
+        <w:spacing w:before="0" w:after="0" w:line="220" w:lineRule="exact"/>
+        <w:ind w:firstLine="0"/>
+        <w:keepNext w:val="0"/>
+        <w:widowControl w:val="0"/>
+      </w:pPr>
+      <w:r>
+        <w:rPr>
+          <w:rFonts w:ascii="Courier New" w:hAnsi="Courier New"/>
+          <w:sz w:val="18"/>
+        </w:rPr>
         <w:t xml:space="preserve"/>
-        <w:br/>
+      </w:r>
+    </w:p>
+    <w:p>
+      <w:pPr>
+        <w:spacing w:before="0" w:after="0" w:line="220" w:lineRule="exact"/>
+        <w:ind w:firstLine="0"/>
+        <w:keepNext w:val="0"/>
+        <w:widowControl w:val="0"/>
+      </w:pPr>
+      <w:r>
+        <w:rPr>
+          <w:rFonts w:ascii="Courier New" w:hAnsi="Courier New"/>
+          <w:sz w:val="18"/>
+        </w:rPr>
         <w:t xml:space="preserve">    # Авторы</w:t>
-        <w:br/>
+      </w:r>
+    </w:p>
+    <w:p>
+      <w:pPr>
+        <w:spacing w:before="0" w:after="0" w:line="220" w:lineRule="exact"/>
+        <w:ind w:firstLine="0"/>
+        <w:keepNext w:val="0"/>
+        <w:widowControl w:val="0"/>
+      </w:pPr>
+      <w:r>
+        <w:rPr>
+          <w:rFonts w:ascii="Courier New" w:hAnsi="Courier New"/>
+          <w:sz w:val="18"/>
+        </w:rPr>
         <w:t xml:space="preserve">    author_text = " ".join(doc["author"]) if doc["author"] else ""</w:t>
-        <w:br/>
+      </w:r>
+    </w:p>
+    <w:p>
+      <w:pPr>
+        <w:spacing w:before="0" w:after="0" w:line="220" w:lineRule="exact"/>
+        <w:ind w:firstLine="0"/>
+        <w:keepNext w:val="0"/>
+        <w:widowControl w:val="0"/>
+      </w:pPr>
+      <w:r>
+        <w:rPr>
+          <w:rFonts w:ascii="Courier New" w:hAnsi="Courier New"/>
+          <w:sz w:val="18"/>
+        </w:rPr>
         <w:t xml:space="preserve">    author_tokens = clean_text(author_text)</w:t>
-        <w:br/>
+      </w:r>
+    </w:p>
+    <w:p>
+      <w:pPr>
+        <w:spacing w:before="0" w:after="0" w:line="220" w:lineRule="exact"/>
+        <w:ind w:firstLine="0"/>
+        <w:keepNext w:val="0"/>
+        <w:widowControl w:val="0"/>
+      </w:pPr>
+      <w:r>
+        <w:rPr>
+          <w:rFonts w:ascii="Courier New" w:hAnsi="Courier New"/>
+          <w:sz w:val="18"/>
+        </w:rPr>
         <w:t xml:space="preserve">    doc["author_tokens"] = author_tokens</w:t>
-        <w:br/>
+      </w:r>
+    </w:p>
+    <w:p>
+      <w:pPr>
+        <w:spacing w:before="0" w:after="0" w:line="220" w:lineRule="exact"/>
+        <w:ind w:firstLine="0"/>
+        <w:keepNext w:val="0"/>
+        <w:widowControl w:val="0"/>
+      </w:pPr>
+      <w:r>
+        <w:rPr>
+          <w:rFonts w:ascii="Courier New" w:hAnsi="Courier New"/>
+          <w:sz w:val="18"/>
+        </w:rPr>
         <w:t xml:space="preserve">    doc["author_stemmed"] = [stemmer.stem(w) for w in author_tokens]</w:t>
-        <w:br/>
+      </w:r>
+    </w:p>
+    <w:p>
+      <w:pPr>
+        <w:spacing w:before="0" w:after="0" w:line="220" w:lineRule="exact"/>
+        <w:ind w:firstLine="0"/>
+        <w:keepNext w:val="0"/>
+        <w:widowControl w:val="0"/>
+      </w:pPr>
+      <w:r>
+        <w:rPr>
+          <w:rFonts w:ascii="Courier New" w:hAnsi="Courier New"/>
+          <w:sz w:val="18"/>
+        </w:rPr>
         <w:t xml:space="preserve">    doc["author_lemmatized"] = [lemmatizer.lemmatize(w) for w in author_tokens]</w:t>
-        <w:br/>
+      </w:r>
+    </w:p>
+    <w:p>
+      <w:pPr>
+        <w:spacing w:before="0" w:after="0" w:line="220" w:lineRule="exact"/>
+        <w:ind w:firstLine="0"/>
+        <w:keepNext w:val="0"/>
+        <w:widowControl w:val="0"/>
+      </w:pPr>
+      <w:r>
+        <w:rPr>
+          <w:rFonts w:ascii="Courier New" w:hAnsi="Courier New"/>
+          <w:sz w:val="18"/>
+        </w:rPr>
         <w:t xml:space="preserve">    </w:t>
-        <w:br/>
+      </w:r>
+    </w:p>
+    <w:p>
+      <w:pPr>
+        <w:spacing w:before="0" w:after="0" w:line="220" w:lineRule="exact"/>
+        <w:ind w:firstLine="0"/>
+        <w:keepNext w:val="0"/>
+        <w:widowControl w:val="0"/>
+      </w:pPr>
+      <w:r>
+        <w:rPr>
+          <w:rFonts w:ascii="Courier New" w:hAnsi="Courier New"/>
+          <w:sz w:val="18"/>
+        </w:rPr>
         <w:t xml:space="preserve">    # Основной текст</w:t>
-        <w:br/>
+      </w:r>
+    </w:p>
+    <w:p>
+      <w:pPr>
+        <w:spacing w:before="0" w:after="0" w:line="220" w:lineRule="exact"/>
+        <w:ind w:firstLine="0"/>
+        <w:keepNext w:val="0"/>
+        <w:widowControl w:val="0"/>
+      </w:pPr>
+      <w:r>
+        <w:rPr>
+          <w:rFonts w:ascii="Courier New" w:hAnsi="Courier New"/>
+          <w:sz w:val="18"/>
+        </w:rPr>
         <w:t xml:space="preserve">    text_tokens = clean_text(doc["text"])</w:t>
-        <w:br/>
+      </w:r>
+    </w:p>
+    <w:p>
+      <w:pPr>
+        <w:spacing w:before="0" w:after="0" w:line="220" w:lineRule="exact"/>
+        <w:ind w:firstLine="0"/>
+        <w:keepNext w:val="0"/>
+        <w:widowControl w:val="0"/>
+      </w:pPr>
+      <w:r>
+        <w:rPr>
+          <w:rFonts w:ascii="Courier New" w:hAnsi="Courier New"/>
+          <w:sz w:val="18"/>
+        </w:rPr>
         <w:t xml:space="preserve">    doc["text_tokens"] = text_tokens</w:t>
-        <w:br/>
+      </w:r>
+    </w:p>
+    <w:p>
+      <w:pPr>
+        <w:spacing w:before="0" w:after="0" w:line="220" w:lineRule="exact"/>
+        <w:ind w:firstLine="0"/>
+        <w:keepNext w:val="0"/>
+        <w:widowControl w:val="0"/>
+      </w:pPr>
+      <w:r>
+        <w:rPr>
+          <w:rFonts w:ascii="Courier New" w:hAnsi="Courier New"/>
+          <w:sz w:val="18"/>
+        </w:rPr>
         <w:t xml:space="preserve">    doc["text_stemmed"] = [stemmer.stem(w) for w in text_tokens]</w:t>
-        <w:br/>
+      </w:r>
+    </w:p>
+    <w:p>
+      <w:pPr>
+        <w:spacing w:before="0" w:after="0" w:line="220" w:lineRule="exact"/>
+        <w:ind w:firstLine="0"/>
+        <w:keepNext w:val="0"/>
+        <w:widowControl w:val="0"/>
+      </w:pPr>
+      <w:r>
+        <w:rPr>
+          <w:rFonts w:ascii="Courier New" w:hAnsi="Courier New"/>
+          <w:sz w:val="18"/>
+        </w:rPr>
         <w:t xml:space="preserve">    doc["text_lemmatized"] = [lemmatizer.lemmatize(w) for w in text_tokens]</w:t>
-        <w:br/>
+      </w:r>
+    </w:p>
+    <w:p>
+      <w:pPr>
+        <w:spacing w:before="0" w:after="0" w:line="220" w:lineRule="exact"/>
+        <w:ind w:firstLine="0"/>
+        <w:keepNext w:val="0"/>
+        <w:widowControl w:val="0"/>
+      </w:pPr>
+      <w:r>
+        <w:rPr>
+          <w:rFonts w:ascii="Courier New" w:hAnsi="Courier New"/>
+          <w:sz w:val="18"/>
+        </w:rPr>
         <w:t xml:space="preserve"/>
-        <w:br/>
+      </w:r>
+    </w:p>
+    <w:p>
+      <w:pPr>
+        <w:spacing w:before="0" w:after="0" w:line="220" w:lineRule="exact"/>
+        <w:ind w:firstLine="0"/>
+        <w:keepNext w:val="0"/>
+        <w:widowControl w:val="0"/>
+      </w:pPr>
+      <w:r>
+        <w:rPr>
+          <w:rFonts w:ascii="Courier New" w:hAnsi="Courier New"/>
+          <w:sz w:val="18"/>
+        </w:rPr>
         <w:t xml:space="preserve">    # Весь текст сразу</w:t>
-        <w:br/>
+      </w:r>
+    </w:p>
+    <w:p>
+      <w:pPr>
+        <w:spacing w:before="0" w:after="0" w:line="220" w:lineRule="exact"/>
+        <w:ind w:firstLine="0"/>
+        <w:keepNext w:val="0"/>
+        <w:widowControl w:val="0"/>
+      </w:pPr>
+      <w:r>
+        <w:rPr>
+          <w:rFonts w:ascii="Courier New" w:hAnsi="Courier New"/>
+          <w:sz w:val="18"/>
+        </w:rPr>
         <w:t xml:space="preserve">    tokens = clean_text(full_text)</w:t>
-        <w:br/>
+      </w:r>
+    </w:p>
+    <w:p>
+      <w:pPr>
+        <w:spacing w:before="0" w:after="0" w:line="220" w:lineRule="exact"/>
+        <w:ind w:firstLine="0"/>
+        <w:keepNext w:val="0"/>
+        <w:widowControl w:val="0"/>
+      </w:pPr>
+      <w:r>
+        <w:rPr>
+          <w:rFonts w:ascii="Courier New" w:hAnsi="Courier New"/>
+          <w:sz w:val="18"/>
+        </w:rPr>
         <w:t xml:space="preserve">    doc["tokens"] = tokens</w:t>
-        <w:br/>
+      </w:r>
+    </w:p>
+    <w:p>
+      <w:pPr>
+        <w:spacing w:before="0" w:after="0" w:line="220" w:lineRule="exact"/>
+        <w:ind w:firstLine="0"/>
+        <w:keepNext w:val="0"/>
+        <w:widowControl w:val="0"/>
+      </w:pPr>
+      <w:r>
+        <w:rPr>
+          <w:rFonts w:ascii="Courier New" w:hAnsi="Courier New"/>
+          <w:sz w:val="18"/>
+        </w:rPr>
         <w:t xml:space="preserve">    doc["stemmed_words"] = [stemmer.stem(word) for word in tokens]</w:t>
-        <w:br/>
+      </w:r>
+    </w:p>
+    <w:p>
+      <w:pPr>
+        <w:spacing w:before="0" w:after="0" w:line="220" w:lineRule="exact"/>
+        <w:ind w:firstLine="0"/>
+        <w:keepNext w:val="0"/>
+        <w:widowControl w:val="0"/>
+      </w:pPr>
+      <w:r>
+        <w:rPr>
+          <w:rFonts w:ascii="Courier New" w:hAnsi="Courier New"/>
+          <w:sz w:val="18"/>
+        </w:rPr>
         <w:t xml:space="preserve">    doc["lemmatized_words"] = [lemmatizer.lemmatize(word) for word in tokens]</w:t>
-        <w:br/>
+      </w:r>
+    </w:p>
+    <w:p>
+      <w:pPr>
+        <w:spacing w:before="0" w:after="0" w:line="220" w:lineRule="exact"/>
+        <w:ind w:firstLine="0"/>
+        <w:keepNext w:val="0"/>
+        <w:widowControl w:val="0"/>
+      </w:pPr>
+      <w:r>
+        <w:rPr>
+          <w:rFonts w:ascii="Courier New" w:hAnsi="Courier New"/>
+          <w:sz w:val="18"/>
+        </w:rPr>
         <w:t xml:space="preserve"/>
-        <w:br/>
+      </w:r>
+    </w:p>
+    <w:p>
+      <w:pPr>
+        <w:spacing w:before="0" w:after="0" w:line="220" w:lineRule="exact"/>
+        <w:ind w:firstLine="0"/>
+        <w:keepNext w:val="0"/>
+        <w:widowControl w:val="0"/>
+      </w:pPr>
+      <w:r>
+        <w:rPr>
+          <w:rFonts w:ascii="Courier New" w:hAnsi="Courier New"/>
+          <w:sz w:val="18"/>
+        </w:rPr>
         <w:t xml:space="preserve"/>
-        <w:br/>
+      </w:r>
+    </w:p>
+    <w:p>
+      <w:pPr>
+        <w:spacing w:before="0" w:after="0" w:line="220" w:lineRule="exact"/>
+        <w:ind w:firstLine="0"/>
+        <w:keepNext w:val="0"/>
+        <w:widowControl w:val="0"/>
+      </w:pPr>
+      <w:r>
+        <w:rPr>
+          <w:rFonts w:ascii="Courier New" w:hAnsi="Courier New"/>
+          <w:sz w:val="18"/>
+        </w:rPr>
         <w:t xml:space="preserve">for query_id, query in queries.items():</w:t>
-        <w:br/>
+      </w:r>
+    </w:p>
+    <w:p>
+      <w:pPr>
+        <w:spacing w:before="0" w:after="0" w:line="220" w:lineRule="exact"/>
+        <w:ind w:firstLine="0"/>
+        <w:keepNext w:val="0"/>
+        <w:widowControl w:val="0"/>
+      </w:pPr>
+      <w:r>
+        <w:rPr>
+          <w:rFonts w:ascii="Courier New" w:hAnsi="Courier New"/>
+          <w:sz w:val="18"/>
+        </w:rPr>
         <w:t xml:space="preserve">    query["raw_words"] = [w for w in word_tokenize((query["title"] + " " + query["text"] + " " + " ".join(query["author"])).lower()) if w.isalpha() or w.isdigit()]</w:t>
-        <w:br/>
+      </w:r>
+    </w:p>
+    <w:p>
+      <w:pPr>
+        <w:spacing w:before="0" w:after="0" w:line="220" w:lineRule="exact"/>
+        <w:ind w:firstLine="0"/>
+        <w:keepNext w:val="0"/>
+        <w:widowControl w:val="0"/>
+      </w:pPr>
+      <w:r>
+        <w:rPr>
+          <w:rFonts w:ascii="Courier New" w:hAnsi="Courier New"/>
+          <w:sz w:val="18"/>
+        </w:rPr>
         <w:t xml:space="preserve">    full_text = query["title"] + " " + query["text"]</w:t>
-        <w:br/>
+      </w:r>
+    </w:p>
+    <w:p>
+      <w:pPr>
+        <w:spacing w:before="0" w:after="0" w:line="220" w:lineRule="exact"/>
+        <w:ind w:firstLine="0"/>
+        <w:keepNext w:val="0"/>
+        <w:widowControl w:val="0"/>
+      </w:pPr>
+      <w:r>
+        <w:rPr>
+          <w:rFonts w:ascii="Courier New" w:hAnsi="Courier New"/>
+          <w:sz w:val="18"/>
+        </w:rPr>
         <w:t xml:space="preserve"/>
-        <w:br/>
+      </w:r>
+    </w:p>
+    <w:p>
+      <w:pPr>
+        <w:spacing w:before="0" w:after="0" w:line="220" w:lineRule="exact"/>
+        <w:ind w:firstLine="0"/>
+        <w:keepNext w:val="0"/>
+        <w:widowControl w:val="0"/>
+      </w:pPr>
+      <w:r>
+        <w:rPr>
+          <w:rFonts w:ascii="Courier New" w:hAnsi="Courier New"/>
+          <w:sz w:val="18"/>
+        </w:rPr>
         <w:t xml:space="preserve">    if query["author"]:</w:t>
-        <w:br/>
+      </w:r>
+    </w:p>
+    <w:p>
+      <w:pPr>
+        <w:spacing w:before="0" w:after="0" w:line="220" w:lineRule="exact"/>
+        <w:ind w:firstLine="0"/>
+        <w:keepNext w:val="0"/>
+        <w:widowControl w:val="0"/>
+      </w:pPr>
+      <w:r>
+        <w:rPr>
+          <w:rFonts w:ascii="Courier New" w:hAnsi="Courier New"/>
+          <w:sz w:val="18"/>
+        </w:rPr>
         <w:t xml:space="preserve">        authors_text = " ".join(query["author"])</w:t>
-        <w:br/>
+      </w:r>
+    </w:p>
+    <w:p>
+      <w:pPr>
+        <w:spacing w:before="0" w:after="0" w:line="220" w:lineRule="exact"/>
+        <w:ind w:firstLine="0"/>
+        <w:keepNext w:val="0"/>
+        <w:widowControl w:val="0"/>
+      </w:pPr>
+      <w:r>
+        <w:rPr>
+          <w:rFonts w:ascii="Courier New" w:hAnsi="Courier New"/>
+          <w:sz w:val="18"/>
+        </w:rPr>
         <w:t xml:space="preserve">        full_text = full_text + " " + authors_text</w:t>
-        <w:br/>
+      </w:r>
+    </w:p>
+    <w:p>
+      <w:pPr>
+        <w:spacing w:before="0" w:after="0" w:line="220" w:lineRule="exact"/>
+        <w:ind w:firstLine="0"/>
+        <w:keepNext w:val="0"/>
+        <w:widowControl w:val="0"/>
+      </w:pPr>
+      <w:r>
+        <w:rPr>
+          <w:rFonts w:ascii="Courier New" w:hAnsi="Courier New"/>
+          <w:sz w:val="18"/>
+        </w:rPr>
         <w:t xml:space="preserve"/>
-        <w:br/>
+      </w:r>
+    </w:p>
+    <w:p>
+      <w:pPr>
+        <w:spacing w:before="0" w:after="0" w:line="220" w:lineRule="exact"/>
+        <w:ind w:firstLine="0"/>
+        <w:keepNext w:val="0"/>
+        <w:widowControl w:val="0"/>
+      </w:pPr>
+      <w:r>
+        <w:rPr>
+          <w:rFonts w:ascii="Courier New" w:hAnsi="Courier New"/>
+          <w:sz w:val="18"/>
+        </w:rPr>
         <w:t xml:space="preserve">    # Заголовок</w:t>
-        <w:br/>
+      </w:r>
+    </w:p>
+    <w:p>
+      <w:pPr>
+        <w:spacing w:before="0" w:after="0" w:line="220" w:lineRule="exact"/>
+        <w:ind w:firstLine="0"/>
+        <w:keepNext w:val="0"/>
+        <w:widowControl w:val="0"/>
+      </w:pPr>
+      <w:r>
+        <w:rPr>
+          <w:rFonts w:ascii="Courier New" w:hAnsi="Courier New"/>
+          <w:sz w:val="18"/>
+        </w:rPr>
         <w:t xml:space="preserve">    title_tokens = clean_text(query["title"])</w:t>
-        <w:br/>
+      </w:r>
+    </w:p>
+    <w:p>
+      <w:pPr>
+        <w:spacing w:before="0" w:after="0" w:line="220" w:lineRule="exact"/>
+        <w:ind w:firstLine="0"/>
+        <w:keepNext w:val="0"/>
+        <w:widowControl w:val="0"/>
+      </w:pPr>
+      <w:r>
+        <w:rPr>
+          <w:rFonts w:ascii="Courier New" w:hAnsi="Courier New"/>
+          <w:sz w:val="18"/>
+        </w:rPr>
         <w:t xml:space="preserve">    query["title_tokens"] = title_tokens</w:t>
-        <w:br/>
+      </w:r>
+    </w:p>
+    <w:p>
+      <w:pPr>
+        <w:spacing w:before="0" w:after="0" w:line="220" w:lineRule="exact"/>
+        <w:ind w:firstLine="0"/>
+        <w:keepNext w:val="0"/>
+        <w:widowControl w:val="0"/>
+      </w:pPr>
+      <w:r>
+        <w:rPr>
+          <w:rFonts w:ascii="Courier New" w:hAnsi="Courier New"/>
+          <w:sz w:val="18"/>
+        </w:rPr>
         <w:t xml:space="preserve">    query["title_stemmed"] = [stemmer.stem(w) for w in title_tokens]</w:t>
-        <w:br/>
+      </w:r>
+    </w:p>
+    <w:p>
+      <w:pPr>
+        <w:spacing w:before="0" w:after="0" w:line="220" w:lineRule="exact"/>
+        <w:ind w:firstLine="0"/>
+        <w:keepNext w:val="0"/>
+        <w:widowControl w:val="0"/>
+      </w:pPr>
+      <w:r>
+        <w:rPr>
+          <w:rFonts w:ascii="Courier New" w:hAnsi="Courier New"/>
+          <w:sz w:val="18"/>
+        </w:rPr>
         <w:t xml:space="preserve">    query["title_lemmatized"] = [lemmatizer.lemmatize(w) for w in title_tokens]</w:t>
-        <w:br/>
+      </w:r>
+    </w:p>
+    <w:p>
+      <w:pPr>
+        <w:spacing w:before="0" w:after="0" w:line="220" w:lineRule="exact"/>
+        <w:ind w:firstLine="0"/>
+        <w:keepNext w:val="0"/>
+        <w:widowControl w:val="0"/>
+      </w:pPr>
+      <w:r>
+        <w:rPr>
+          <w:rFonts w:ascii="Courier New" w:hAnsi="Courier New"/>
+          <w:sz w:val="18"/>
+        </w:rPr>
         <w:t xml:space="preserve">    </w:t>
-        <w:br/>
+      </w:r>
+    </w:p>
+    <w:p>
+      <w:pPr>
+        <w:spacing w:before="0" w:after="0" w:line="220" w:lineRule="exact"/>
+        <w:ind w:firstLine="0"/>
+        <w:keepNext w:val="0"/>
+        <w:widowControl w:val="0"/>
+      </w:pPr>
+      <w:r>
+        <w:rPr>
+          <w:rFonts w:ascii="Courier New" w:hAnsi="Courier New"/>
+          <w:sz w:val="18"/>
+        </w:rPr>
         <w:t xml:space="preserve">    # Авторы</w:t>
-        <w:br/>
+      </w:r>
+    </w:p>
+    <w:p>
+      <w:pPr>
+        <w:spacing w:before="0" w:after="0" w:line="220" w:lineRule="exact"/>
+        <w:ind w:firstLine="0"/>
+        <w:keepNext w:val="0"/>
+        <w:widowControl w:val="0"/>
+      </w:pPr>
+      <w:r>
+        <w:rPr>
+          <w:rFonts w:ascii="Courier New" w:hAnsi="Courier New"/>
+          <w:sz w:val="18"/>
+        </w:rPr>
         <w:t xml:space="preserve">    author_text = " ".join(query["author"]) if query["author"] else ""</w:t>
-        <w:br/>
+      </w:r>
+    </w:p>
+    <w:p>
+      <w:pPr>
+        <w:spacing w:before="0" w:after="0" w:line="220" w:lineRule="exact"/>
+        <w:ind w:firstLine="0"/>
+        <w:keepNext w:val="0"/>
+        <w:widowControl w:val="0"/>
+      </w:pPr>
+      <w:r>
+        <w:rPr>
+          <w:rFonts w:ascii="Courier New" w:hAnsi="Courier New"/>
+          <w:sz w:val="18"/>
+        </w:rPr>
         <w:t xml:space="preserve">    author_tokens = clean_text(author_text)</w:t>
-        <w:br/>
+      </w:r>
+    </w:p>
+    <w:p>
+      <w:pPr>
+        <w:spacing w:before="0" w:after="0" w:line="220" w:lineRule="exact"/>
+        <w:ind w:firstLine="0"/>
+        <w:keepNext w:val="0"/>
+        <w:widowControl w:val="0"/>
+      </w:pPr>
+      <w:r>
+        <w:rPr>
+          <w:rFonts w:ascii="Courier New" w:hAnsi="Courier New"/>
+          <w:sz w:val="18"/>
+        </w:rPr>
         <w:t xml:space="preserve">    query["author_tokens"] = author_tokens</w:t>
-        <w:br/>
+      </w:r>
+    </w:p>
+    <w:p>
+      <w:pPr>
+        <w:spacing w:before="0" w:after="0" w:line="220" w:lineRule="exact"/>
+        <w:ind w:firstLine="0"/>
+        <w:keepNext w:val="0"/>
+        <w:widowControl w:val="0"/>
+      </w:pPr>
+      <w:r>
+        <w:rPr>
+          <w:rFonts w:ascii="Courier New" w:hAnsi="Courier New"/>
+          <w:sz w:val="18"/>
+        </w:rPr>
         <w:t xml:space="preserve">    query["author_stemmed"] = [stemmer.stem(w) for w in author_tokens]</w:t>
-        <w:br/>
+      </w:r>
+    </w:p>
+    <w:p>
+      <w:pPr>
+        <w:spacing w:before="0" w:after="0" w:line="220" w:lineRule="exact"/>
+        <w:ind w:firstLine="0"/>
+        <w:keepNext w:val="0"/>
+        <w:widowControl w:val="0"/>
+      </w:pPr>
+      <w:r>
+        <w:rPr>
+          <w:rFonts w:ascii="Courier New" w:hAnsi="Courier New"/>
+          <w:sz w:val="18"/>
+        </w:rPr>
         <w:t xml:space="preserve">    query["author_lemmatized"] = [lemmatizer.lemmatize(w) for w in author_tokens]</w:t>
-        <w:br/>
+      </w:r>
+    </w:p>
+    <w:p>
+      <w:pPr>
+        <w:spacing w:before="0" w:after="0" w:line="220" w:lineRule="exact"/>
+        <w:ind w:firstLine="0"/>
+        <w:keepNext w:val="0"/>
+        <w:widowControl w:val="0"/>
+      </w:pPr>
+      <w:r>
+        <w:rPr>
+          <w:rFonts w:ascii="Courier New" w:hAnsi="Courier New"/>
+          <w:sz w:val="18"/>
+        </w:rPr>
         <w:t xml:space="preserve">    </w:t>
-        <w:br/>
+      </w:r>
+    </w:p>
+    <w:p>
+      <w:pPr>
+        <w:spacing w:before="0" w:after="0" w:line="220" w:lineRule="exact"/>
+        <w:ind w:firstLine="0"/>
+        <w:keepNext w:val="0"/>
+        <w:widowControl w:val="0"/>
+      </w:pPr>
+      <w:r>
+        <w:rPr>
+          <w:rFonts w:ascii="Courier New" w:hAnsi="Courier New"/>
+          <w:sz w:val="18"/>
+        </w:rPr>
         <w:t xml:space="preserve">    # Основной текст</w:t>
-        <w:br/>
+      </w:r>
+    </w:p>
+    <w:p>
+      <w:pPr>
+        <w:spacing w:before="0" w:after="0" w:line="220" w:lineRule="exact"/>
+        <w:ind w:firstLine="0"/>
+        <w:keepNext w:val="0"/>
+        <w:widowControl w:val="0"/>
+      </w:pPr>
+      <w:r>
+        <w:rPr>
+          <w:rFonts w:ascii="Courier New" w:hAnsi="Courier New"/>
+          <w:sz w:val="18"/>
+        </w:rPr>
         <w:t xml:space="preserve">    text_tokens = clean_text(query["text"])</w:t>
-        <w:br/>
+      </w:r>
+    </w:p>
+    <w:p>
+      <w:pPr>
+        <w:spacing w:before="0" w:after="0" w:line="220" w:lineRule="exact"/>
+        <w:ind w:firstLine="0"/>
+        <w:keepNext w:val="0"/>
+        <w:widowControl w:val="0"/>
+      </w:pPr>
+      <w:r>
+        <w:rPr>
+          <w:rFonts w:ascii="Courier New" w:hAnsi="Courier New"/>
+          <w:sz w:val="18"/>
+        </w:rPr>
         <w:t xml:space="preserve">    query["text_tokens"] = text_tokens</w:t>
-        <w:br/>
+      </w:r>
+    </w:p>
+    <w:p>
+      <w:pPr>
+        <w:spacing w:before="0" w:after="0" w:line="220" w:lineRule="exact"/>
+        <w:ind w:firstLine="0"/>
+        <w:keepNext w:val="0"/>
+        <w:widowControl w:val="0"/>
+      </w:pPr>
+      <w:r>
+        <w:rPr>
+          <w:rFonts w:ascii="Courier New" w:hAnsi="Courier New"/>
+          <w:sz w:val="18"/>
+        </w:rPr>
         <w:t xml:space="preserve">    query["text_stemmed"] = [stemmer.stem(w) for w in text_tokens]</w:t>
-        <w:br/>
+      </w:r>
+    </w:p>
+    <w:p>
+      <w:pPr>
+        <w:spacing w:before="0" w:after="0" w:line="220" w:lineRule="exact"/>
+        <w:ind w:firstLine="0"/>
+        <w:keepNext w:val="0"/>
+        <w:widowControl w:val="0"/>
+      </w:pPr>
+      <w:r>
+        <w:rPr>
+          <w:rFonts w:ascii="Courier New" w:hAnsi="Courier New"/>
+          <w:sz w:val="18"/>
+        </w:rPr>
         <w:t xml:space="preserve">    query["text_lemmatized"] = [lemmatizer.lemmatize(w) for w in text_tokens]</w:t>
-        <w:br/>
+      </w:r>
+    </w:p>
+    <w:p>
+      <w:pPr>
+        <w:spacing w:before="0" w:after="0" w:line="220" w:lineRule="exact"/>
+        <w:ind w:firstLine="0"/>
+        <w:keepNext w:val="0"/>
+        <w:widowControl w:val="0"/>
+      </w:pPr>
+      <w:r>
+        <w:rPr>
+          <w:rFonts w:ascii="Courier New" w:hAnsi="Courier New"/>
+          <w:sz w:val="18"/>
+        </w:rPr>
         <w:t xml:space="preserve"/>
-        <w:br/>
+      </w:r>
+    </w:p>
+    <w:p>
+      <w:pPr>
+        <w:spacing w:before="0" w:after="0" w:line="220" w:lineRule="exact"/>
+        <w:ind w:firstLine="0"/>
+        <w:keepNext w:val="0"/>
+        <w:widowControl w:val="0"/>
+      </w:pPr>
+      <w:r>
+        <w:rPr>
+          <w:rFonts w:ascii="Courier New" w:hAnsi="Courier New"/>
+          <w:sz w:val="18"/>
+        </w:rPr>
         <w:t xml:space="preserve">    # Весь текст сразу</w:t>
-        <w:br/>
+      </w:r>
+    </w:p>
+    <w:p>
+      <w:pPr>
+        <w:spacing w:before="0" w:after="0" w:line="220" w:lineRule="exact"/>
+        <w:ind w:firstLine="0"/>
+        <w:keepNext w:val="0"/>
+        <w:widowControl w:val="0"/>
+      </w:pPr>
+      <w:r>
+        <w:rPr>
+          <w:rFonts w:ascii="Courier New" w:hAnsi="Courier New"/>
+          <w:sz w:val="18"/>
+        </w:rPr>
         <w:t xml:space="preserve">    tokens = clean_text(full_text)</w:t>
-        <w:br/>
+      </w:r>
+    </w:p>
+    <w:p>
+      <w:pPr>
+        <w:spacing w:before="0" w:after="0" w:line="220" w:lineRule="exact"/>
+        <w:ind w:firstLine="0"/>
+        <w:keepNext w:val="0"/>
+        <w:widowControl w:val="0"/>
+      </w:pPr>
+      <w:r>
+        <w:rPr>
+          <w:rFonts w:ascii="Courier New" w:hAnsi="Courier New"/>
+          <w:sz w:val="18"/>
+        </w:rPr>
         <w:t xml:space="preserve">    query["tokens"] = tokens</w:t>
-        <w:br/>
+      </w:r>
+    </w:p>
+    <w:p>
+      <w:pPr>
+        <w:spacing w:before="0" w:after="0" w:line="220" w:lineRule="exact"/>
+        <w:ind w:firstLine="0"/>
+        <w:keepNext w:val="0"/>
+        <w:widowControl w:val="0"/>
+      </w:pPr>
+      <w:r>
+        <w:rPr>
+          <w:rFonts w:ascii="Courier New" w:hAnsi="Courier New"/>
+          <w:sz w:val="18"/>
+        </w:rPr>
         <w:t xml:space="preserve">    query["stemmed_words"] = [stemmer.stem(word) for word in tokens]</w:t>
-        <w:br/>
+      </w:r>
+    </w:p>
+    <w:p>
+      <w:pPr>
+        <w:spacing w:before="0" w:after="0" w:line="220" w:lineRule="exact"/>
+        <w:ind w:firstLine="0"/>
+        <w:keepNext w:val="0"/>
+        <w:widowControl w:val="0"/>
+      </w:pPr>
+      <w:r>
+        <w:rPr>
+          <w:rFonts w:ascii="Courier New" w:hAnsi="Courier New"/>
+          <w:sz w:val="18"/>
+        </w:rPr>
         <w:t xml:space="preserve">    query["lemmatized_words"] = [lemmatizer.lemmatize(word) for word in tokens]</w:t>
       </w:r>
     </w:p>
@@ -7184,44 +8913,226 @@
     </w:p>
     <w:p>
       <w:pPr>
-        <w:spacing w:after="120"/>
-        <w:rPr>
-          <w:rFonts w:ascii="Courier New" w:eastAsia="Courier New" w:hAnsi="Courier New"/>
-          <w:i/>
-          <w:iCs/>
-          <w:sz w:val="20"/>
-          <w:lang w:val="en-US"/>
-        </w:rPr>
-      </w:pPr>
-      <w:r>
+        <w:spacing w:before="0" w:after="0" w:line="220" w:lineRule="exact"/>
+        <w:ind w:firstLine="0"/>
+        <w:keepNext w:val="0"/>
+        <w:widowControl w:val="0"/>
+      </w:pPr>
+      <w:r>
+        <w:rPr>
+          <w:rFonts w:ascii="Courier New" w:hAnsi="Courier New"/>
+          <w:sz w:val="18"/>
+        </w:rPr>
         <w:t xml:space="preserve">def bm25_search(query, query_field, rich_idx, k1=1.2, b=0.75, fallback_idx=None):</w:t>
-        <w:br/>
+      </w:r>
+    </w:p>
+    <w:p>
+      <w:pPr>
+        <w:spacing w:before="0" w:after="0" w:line="220" w:lineRule="exact"/>
+        <w:ind w:firstLine="0"/>
+        <w:keepNext w:val="0"/>
+        <w:widowControl w:val="0"/>
+      </w:pPr>
+      <w:r>
+        <w:rPr>
+          <w:rFonts w:ascii="Courier New" w:hAnsi="Courier New"/>
+          <w:sz w:val="18"/>
+        </w:rPr>
         <w:t xml:space="preserve">    if not math.isfinite(k1) or k1 &lt;= 0 or not math.isfinite(b) or not 0 &lt;= b &lt;= 1:</w:t>
-        <w:br/>
+      </w:r>
+    </w:p>
+    <w:p>
+      <w:pPr>
+        <w:spacing w:before="0" w:after="0" w:line="220" w:lineRule="exact"/>
+        <w:ind w:firstLine="0"/>
+        <w:keepNext w:val="0"/>
+        <w:widowControl w:val="0"/>
+      </w:pPr>
+      <w:r>
+        <w:rPr>
+          <w:rFonts w:ascii="Courier New" w:hAnsi="Courier New"/>
+          <w:sz w:val="18"/>
+        </w:rPr>
         <w:t xml:space="preserve">        raise ValueError("BM25 requires finite k1 &gt; 0 and 0 &lt;= b &lt;= 1")</w:t>
-        <w:br/>
+      </w:r>
+    </w:p>
+    <w:p>
+      <w:pPr>
+        <w:spacing w:before="0" w:after="0" w:line="220" w:lineRule="exact"/>
+        <w:ind w:firstLine="0"/>
+        <w:keepNext w:val="0"/>
+        <w:widowControl w:val="0"/>
+      </w:pPr>
+      <w:r>
+        <w:rPr>
+          <w:rFonts w:ascii="Courier New" w:hAnsi="Courier New"/>
+          <w:sz w:val="18"/>
+        </w:rPr>
         <w:t xml:space="preserve">    scores = defaultdict(float)</w:t>
-        <w:br/>
+      </w:r>
+    </w:p>
+    <w:p>
+      <w:pPr>
+        <w:spacing w:before="0" w:after="0" w:line="220" w:lineRule="exact"/>
+        <w:ind w:firstLine="0"/>
+        <w:keepNext w:val="0"/>
+        <w:widowControl w:val="0"/>
+      </w:pPr>
+      <w:r>
+        <w:rPr>
+          <w:rFonts w:ascii="Courier New" w:hAnsi="Courier New"/>
+          <w:sz w:val="18"/>
+        </w:rPr>
         <w:t xml:space="preserve">    avg_dl = rich_idx["avg_dl"]</w:t>
-        <w:br/>
+      </w:r>
+    </w:p>
+    <w:p>
+      <w:pPr>
+        <w:spacing w:before="0" w:after="0" w:line="220" w:lineRule="exact"/>
+        <w:ind w:firstLine="0"/>
+        <w:keepNext w:val="0"/>
+        <w:widowControl w:val="0"/>
+      </w:pPr>
+      <w:r>
+        <w:rPr>
+          <w:rFonts w:ascii="Courier New" w:hAnsi="Courier New"/>
+          <w:sz w:val="18"/>
+        </w:rPr>
         <w:t xml:space="preserve">    if avg_dl &gt; 0:</w:t>
-        <w:br/>
+      </w:r>
+    </w:p>
+    <w:p>
+      <w:pPr>
+        <w:spacing w:before="0" w:after="0" w:line="220" w:lineRule="exact"/>
+        <w:ind w:firstLine="0"/>
+        <w:keepNext w:val="0"/>
+        <w:widowControl w:val="0"/>
+      </w:pPr>
+      <w:r>
+        <w:rPr>
+          <w:rFonts w:ascii="Courier New" w:hAnsi="Courier New"/>
+          <w:sz w:val="18"/>
+        </w:rPr>
         <w:t xml:space="preserve">        for word in query[query_field]:</w:t>
-        <w:br/>
+      </w:r>
+    </w:p>
+    <w:p>
+      <w:pPr>
+        <w:spacing w:before="0" w:after="0" w:line="220" w:lineRule="exact"/>
+        <w:ind w:firstLine="0"/>
+        <w:keepNext w:val="0"/>
+        <w:widowControl w:val="0"/>
+      </w:pPr>
+      <w:r>
+        <w:rPr>
+          <w:rFonts w:ascii="Courier New" w:hAnsi="Courier New"/>
+          <w:sz w:val="18"/>
+        </w:rPr>
         <w:t xml:space="preserve">            for doc_id, meta in rich_idx["inverted_index"].get(word, {}).items():</w:t>
-        <w:br/>
+      </w:r>
+    </w:p>
+    <w:p>
+      <w:pPr>
+        <w:spacing w:before="0" w:after="0" w:line="220" w:lineRule="exact"/>
+        <w:ind w:firstLine="0"/>
+        <w:keepNext w:val="0"/>
+        <w:widowControl w:val="0"/>
+      </w:pPr>
+      <w:r>
+        <w:rPr>
+          <w:rFonts w:ascii="Courier New" w:hAnsi="Courier New"/>
+          <w:sz w:val="18"/>
+        </w:rPr>
         <w:t xml:space="preserve">                tf = meta["tf"]</w:t>
-        <w:br/>
+      </w:r>
+    </w:p>
+    <w:p>
+      <w:pPr>
+        <w:spacing w:before="0" w:after="0" w:line="220" w:lineRule="exact"/>
+        <w:ind w:firstLine="0"/>
+        <w:keepNext w:val="0"/>
+        <w:widowControl w:val="0"/>
+      </w:pPr>
+      <w:r>
+        <w:rPr>
+          <w:rFonts w:ascii="Courier New" w:hAnsi="Courier New"/>
+          <w:sz w:val="18"/>
+        </w:rPr>
         <w:t xml:space="preserve">                dl = rich_idx["doc_lengths"][doc_id]</w:t>
-        <w:br/>
+      </w:r>
+    </w:p>
+    <w:p>
+      <w:pPr>
+        <w:spacing w:before="0" w:after="0" w:line="220" w:lineRule="exact"/>
+        <w:ind w:firstLine="0"/>
+        <w:keepNext w:val="0"/>
+        <w:widowControl w:val="0"/>
+      </w:pPr>
+      <w:r>
+        <w:rPr>
+          <w:rFonts w:ascii="Courier New" w:hAnsi="Courier New"/>
+          <w:sz w:val="18"/>
+        </w:rPr>
         <w:t xml:space="preserve">                scores[doc_id] += rich_idx["bm25_idf"][word] * tf * (k1 + 1) / (tf + k1 * (1 - b + b * dl / avg_dl))</w:t>
-        <w:br/>
+      </w:r>
+    </w:p>
+    <w:p>
+      <w:pPr>
+        <w:spacing w:before="0" w:after="0" w:line="220" w:lineRule="exact"/>
+        <w:ind w:firstLine="0"/>
+        <w:keepNext w:val="0"/>
+        <w:widowControl w:val="0"/>
+      </w:pPr>
+      <w:r>
+        <w:rPr>
+          <w:rFonts w:ascii="Courier New" w:hAnsi="Courier New"/>
+          <w:sz w:val="18"/>
+        </w:rPr>
         <w:t xml:space="preserve">    if not scores and fallback_idx is not None:</w:t>
-        <w:br/>
+      </w:r>
+    </w:p>
+    <w:p>
+      <w:pPr>
+        <w:spacing w:before="0" w:after="0" w:line="220" w:lineRule="exact"/>
+        <w:ind w:firstLine="0"/>
+        <w:keepNext w:val="0"/>
+        <w:widowControl w:val="0"/>
+      </w:pPr>
+      <w:r>
+        <w:rPr>
+          <w:rFonts w:ascii="Courier New" w:hAnsi="Courier New"/>
+          <w:sz w:val="18"/>
+        </w:rPr>
         <w:t xml:space="preserve">        results = bm25_search(query, query_field_for(fallback_idx["field"]), fallback_idx, k1, b)</w:t>
-        <w:br/>
+      </w:r>
+    </w:p>
+    <w:p>
+      <w:pPr>
+        <w:spacing w:before="0" w:after="0" w:line="220" w:lineRule="exact"/>
+        <w:ind w:firstLine="0"/>
+        <w:keepNext w:val="0"/>
+        <w:widowControl w:val="0"/>
+      </w:pPr>
+      <w:r>
+        <w:rPr>
+          <w:rFonts w:ascii="Courier New" w:hAnsi="Courier New"/>
+          <w:sz w:val="18"/>
+        </w:rPr>
         <w:t xml:space="preserve">        return [(doc_id, score * 0.5) for doc_id, score in results]</w:t>
-        <w:br/>
+      </w:r>
+    </w:p>
+    <w:p>
+      <w:pPr>
+        <w:spacing w:before="0" w:after="0" w:line="220" w:lineRule="exact"/>
+        <w:ind w:firstLine="0"/>
+        <w:keepNext w:val="0"/>
+        <w:widowControl w:val="0"/>
+      </w:pPr>
+      <w:r>
+        <w:rPr>
+          <w:rFonts w:ascii="Courier New" w:hAnsi="Courier New"/>
+          <w:sz w:val="18"/>
+        </w:rPr>
         <w:t xml:space="preserve">    return sorted(scores.items(), key=lambda item: (-item[1], item[0]))</w:t>
       </w:r>
     </w:p>
@@ -8794,7 +10705,7 @@
               <w:rPr>
                 <w:lang w:val="ru-RU"/>
               </w:rPr>
-              <w:t>Максимизирует число совпадений между запросами и документами</w:t>
+              <w:t>Наибольший MAP BM25 среди проверенных вариантов</w:t>
             </w:r>
           </w:p>
         </w:tc>
@@ -8974,7 +10885,7 @@
               <w:rPr>
                 <w:lang w:val="ru-RU"/>
               </w:rPr>
-              <w:t>Уравнивает короткие и длинные документы</w:t>
+              <w:t>Контролирует влияние длины внутри формулы BM25</w:t>
             </w:r>
           </w:p>
         </w:tc>

</xml_diff>